<commit_message>
feat: show the UADER degree and DevOps diploma
- Education gets a 'Degree and diploma' row: image cards with a dialog
  viewer. Images come from the PDFs with the DNI and QR covered; the
  original PDFs are not in the repo. Gold 'Legendary' frames in fun mode.
- Education text and both Word CVs/PDFs match the diploma: Analista de
  Sistemas (UADER, Facultad de Ciencia y Tecnología, July 2025) and
  DevOps Diploma 250 h (UNC FCEFyN · Mundos E).
- Includes pending edits: new LinkedIn URL, e-UADER '4 months' wording,
  C&S Informática.

Co-Authored-By: Claude Opus 5.5 <noreply@anthropic.com>
</commit_message>
<xml_diff>
--- a/public/renzo-carletti-cv-es.docx
+++ b/public/renzo-carletti-cv-es.docx
@@ -173,7 +173,7 @@
           <w:iCs w:val="1"/>
           <w:rtl w:val="0"/>
         </w:rPr>
-        <w:t xml:space="preserve">https://www.linkedin.com/in/renzo-emiliano-carletti-7bbaba20b/</w:t>
+        <w:t xml:space="preserve">https://www.linkedin.com/in/renzo-carletti/</w:t>
       </w:r>
       <w:r>
         <w:rPr>
@@ -461,7 +461,7 @@
           <w:iCs w:val="1"/>
           <w:rtl w:val="0"/>
         </w:rPr>
-        <w:t xml:space="preserve">CyS Informática | Remoto | Contrato</w:t>
+        <w:t xml:space="preserve">C&amp;S Informática | Remoto | Contrato</w:t>
       </w:r>
       <w:r>
         <w:rPr>
@@ -650,7 +650,7 @@
         <w:rPr>
           <w:rtl w:val="0"/>
         </w:rPr>
-        <w:t xml:space="preserve">Pasé un sitio Drupal monolítico a una arquitectura headless: Drupal sirve el contenido por APIs REST con OAuth2 y React renderiza el frontend.</w:t>
+        <w:t xml:space="preserve">Trabajé en un equipo ágil que pasó un sitio Drupal monolítico a una arquitectura headless: Drupal sirve el contenido por APIs REST con OAuth2 y React renderiza el frontend.</w:t>
       </w:r>
     </w:p>
     <w:p>
@@ -810,7 +810,7 @@
           <w:vertAlign w:val="baseline"/>
           <w:rtl w:val="0"/>
         </w:rPr>
-        <w:t xml:space="preserve">Acompañé a compañeros del equipo en calidad de código y revisiones.</w:t>
+        <w:t xml:space="preserve">Enseñé desarrollo en Drupal a un compañero del equipo y ayudé con la calidad del código en las revisiones.</w:t>
       </w:r>
       <w:r>
         <w:rPr>
@@ -1016,7 +1016,7 @@
         <w:rPr>
           <w:rtl w:val="0"/>
         </w:rPr>
-        <w:t xml:space="preserve">2.000+ usuarios registrados y 1.100+ certificados emitidos.</w:t>
+        <w:t xml:space="preserve">2.000+ usuarios registrados y 1.100+ certificados emitidos en sus primeros 4 meses.</w:t>
       </w:r>
     </w:p>
     <w:p>
@@ -1032,7 +1032,7 @@
         <w:rPr>
           <w:rtl w:val="0"/>
         </w:rPr>
-        <w:t xml:space="preserve">Capacito al equipo en buenas prácticas de Drupal y gestión del ciclo de vida de proyectos.</w:t>
+        <w:t xml:space="preserve">Capacité a un compañero desarrollador en programación Drupal y capacito al personal de la universidad en el uso de los sitios: carga de contenido, actualización de páginas y plantillas de certificados.</w:t>
       </w:r>
     </w:p>
     <w:p>
@@ -1272,37 +1272,37 @@
           <w:bCs w:val="0"/>
           <w:rtl w:val="0"/>
         </w:rPr>
-        <w:t xml:space="preserve">    Egresado: 2025</w:t>
-      </w:r>
-    </w:p>
-    <w:p>
-      <w:pPr>
-        <w:rPr/>
-      </w:pPr>
-      <w:r>
-        <w:rPr>
-          <w:b w:val="1"/>
-          <w:bCs w:val="1"/>
-          <w:rtl w:val="0"/>
-        </w:rPr>
-        <w:t xml:space="preserve">Tecnicatura: </w:t>
-      </w:r>
-      <w:r>
-        <w:rPr>
-          <w:rtl w:val="0"/>
-        </w:rPr>
-        <w:t xml:space="preserve">Sistemas de Información</w:t>
-      </w:r>
-    </w:p>
-    <w:p>
-      <w:pPr>
-        <w:rPr/>
-      </w:pPr>
-      <w:r>
-        <w:rPr>
-          <w:rtl w:val="0"/>
-        </w:rPr>
-        <w:t xml:space="preserve">Orientación: Analista de Sistemas de Información</w:t>
+        <w:t xml:space="preserve">    Egresado: julio 2025</w:t>
+      </w:r>
+    </w:p>
+    <w:p>
+      <w:pPr>
+        <w:rPr/>
+      </w:pPr>
+      <w:r>
+        <w:rPr>
+          <w:b w:val="1"/>
+          <w:bCs w:val="1"/>
+          <w:rtl w:val="0"/>
+        </w:rPr>
+        <w:t xml:space="preserve">Título: </w:t>
+      </w:r>
+      <w:r>
+        <w:rPr>
+          <w:rtl w:val="0"/>
+        </w:rPr>
+        <w:t xml:space="preserve">Analista de Sistemas</w:t>
+      </w:r>
+    </w:p>
+    <w:p>
+      <w:pPr>
+        <w:rPr/>
+      </w:pPr>
+      <w:r>
+        <w:rPr>
+          <w:rtl w:val="0"/>
+        </w:rPr>
+        <w:t xml:space="preserve">Carrera: Análisis de Sistemas · Facultad de Ciencia y Tecnología</w:t>
       </w:r>
     </w:p>
     <w:p>
@@ -1458,7 +1458,7 @@
           <w:bCs w:val="1"/>
           <w:rtl w:val="0"/>
         </w:rPr>
-        <w:t xml:space="preserve">Diplomatura en Ingeniería DevOps</w:t>
+        <w:t xml:space="preserve">Diplomatura en DevOps (250 h)</w:t>
       </w:r>
       <w:r>
         <w:rPr>
@@ -1476,7 +1476,7 @@
         <w:rPr>
           <w:rtl w:val="0"/>
         </w:rPr>
-        <w:t xml:space="preserve">Mundos E</w:t>
+        <w:t xml:space="preserve">UNC FCEFyN · Mundos E</w:t>
       </w:r>
     </w:p>
     <w:p>

</xml_diff>